<commit_message>
Sync local tracked changes to origin/main
</commit_message>
<xml_diff>
--- a/zetech/PROJECT TEMPLATE DSE-DCS-DIT-DBIT.docx
+++ b/zetech/PROJECT TEMPLATE DSE-DCS-DIT-DBIT.docx
@@ -1199,15 +1199,15 @@
           <w:sz w:val="22"/>
           <w:szCs w:val="22"/>
         </w:rPr>
-        <w:t xml:space="preserve">      </w:t>
-      </w:r>
-      <w:r>
-        <w:rPr>
-          <w:rFonts w:ascii="Montserrat Medium" w:hAnsi="Montserrat Medium" w:cs="Times New Roman"/>
-          <w:sz w:val="22"/>
-          <w:szCs w:val="22"/>
-        </w:rPr>
-        <w:t xml:space="preserve"> Sign</w:t>
+        <w:t xml:space="preserve"> Chebet </w:t>
+      </w:r>
+      <w:r>
+        <w:rPr>
+          <w:rFonts w:ascii="Montserrat Medium" w:hAnsi="Montserrat Medium" w:cs="Times New Roman"/>
+          <w:sz w:val="22"/>
+          <w:szCs w:val="22"/>
+        </w:rPr>
+        <w:t xml:space="preserve">Chelule Sign</w:t>
       </w:r>
       <w:r>
         <w:rPr>
@@ -4171,7 +4171,9 @@
         <w:t xml:space="preserve">Table of contents</w:t>
       </w:r>
       <w:bookmarkEnd w:id="20"/>
-      <w:r/>
+      <w:r>
+        <w:t xml:space="preserve"> </w:t>
+      </w:r>
       <w:r>
         <w:rPr>
           <w:rFonts w:ascii="Montserrat Medium" w:hAnsi="Montserrat Medium"/>

</xml_diff>